<commit_message>
memoir: apply expanded §2.4 to corrige.docx
Monte-Carlo simulation section now matches the base memoir:
log-normal IIV model, parameter table (8 rows), step-by-step procedure,
N=300 justification, summary statistics definition.

https://claude.ai/code/session_01Xq7iVQ2YjVtBT1RakGGhea
</commit_message>
<xml_diff>
--- a/memoire_stage_M2_PKPD_hematotoxicite_corrige.docx
+++ b/memoire_stage_M2_PKPD_hematotoxicite_corrige.docx
@@ -6190,405 +6190,1173 @@
     </w:p>
     <w:p>
       <w:pPr>
-        <w:spacing w:before="240" w:after="80"/>
-        <w:rPr>
-          <w:lang w:val="fr-FR"/>
-        </w:rPr>
+        <w:jc w:val="left"/>
+        <w:spacing w:before="240" w:after="120"/>
       </w:pPr>
       <w:r>
         <w:rPr>
           <w:rFonts w:ascii="Times New Roman" w:hAnsi="Times New Roman"/>
           <w:b/>
-          <w:color w:val="34495E"/>
+          <w:color w:val="2C3E50"/>
           <w:sz w:val="28"/>
-          <w:lang w:val="fr-FR"/>
-        </w:rPr>
-        <w:t>2.5 Simulation de population virtuelle</w:t>
+        </w:rPr>
+        <w:t>2.4 Simulation de population virtuelle</w:t>
       </w:r>
     </w:p>
     <w:p>
       <w:pPr>
+        <w:jc w:val="both"/>
+        <w:ind w:firstLine="567"/>
         <w:spacing w:after="120"/>
-        <w:ind w:firstLine="567"/>
-        <w:jc w:val="both"/>
-        <w:rPr>
-          <w:lang w:val="fr-FR"/>
-        </w:rPr>
-      </w:pPr>
-      <w:r>
-        <w:rPr>
-          <w:rFonts w:ascii="Times New Roman" w:hAnsi="Times New Roman"/>
-          <w:sz w:val="24"/>
-          <w:lang w:val="fr-FR"/>
-        </w:rPr>
-        <w:t>Pour la simulation de l'</w:t>
-      </w:r>
-      <w:proofErr w:type="spellStart"/>
-      <w:r>
-        <w:rPr>
-          <w:rFonts w:ascii="Times New Roman" w:hAnsi="Times New Roman"/>
-          <w:sz w:val="24"/>
-          <w:lang w:val="fr-FR"/>
-        </w:rPr>
-        <w:t>hématotoxicité</w:t>
-      </w:r>
-      <w:proofErr w:type="spellEnd"/>
-      <w:r>
-        <w:rPr>
-          <w:rFonts w:ascii="Times New Roman" w:hAnsi="Times New Roman"/>
-          <w:sz w:val="24"/>
-          <w:lang w:val="fr-FR"/>
-        </w:rPr>
-        <w:t xml:space="preserve"> induite par le T-</w:t>
-      </w:r>
-      <w:proofErr w:type="spellStart"/>
-      <w:r>
-        <w:rPr>
-          <w:rFonts w:ascii="Times New Roman" w:hAnsi="Times New Roman"/>
-          <w:sz w:val="24"/>
-          <w:lang w:val="fr-FR"/>
-        </w:rPr>
-        <w:t>DXd</w:t>
-      </w:r>
-      <w:proofErr w:type="spellEnd"/>
-      <w:r>
-        <w:rPr>
-          <w:rFonts w:ascii="Times New Roman" w:hAnsi="Times New Roman"/>
-          <w:sz w:val="24"/>
-          <w:lang w:val="fr-FR"/>
-        </w:rPr>
-        <w:t xml:space="preserve"> en population humaine, une cohorte virtuelle de N=300 patients </w:t>
-      </w:r>
-      <w:proofErr w:type="gramStart"/>
-      <w:r>
-        <w:rPr>
-          <w:rFonts w:ascii="Times New Roman" w:hAnsi="Times New Roman"/>
-          <w:sz w:val="24"/>
-          <w:lang w:val="fr-FR"/>
-        </w:rPr>
-        <w:t>a</w:t>
-      </w:r>
-      <w:proofErr w:type="gramEnd"/>
-      <w:r>
-        <w:rPr>
-          <w:rFonts w:ascii="Times New Roman" w:hAnsi="Times New Roman"/>
-          <w:sz w:val="24"/>
-          <w:lang w:val="fr-FR"/>
-        </w:rPr>
-        <w:t xml:space="preserve"> été générée selon les étapes suivantes :</w:t>
+      </w:pPr>
+      <w:r>
+        <w:rPr>
+          <w:rFonts w:ascii="Times New Roman" w:hAnsi="Times New Roman"/>
+          <w:sz w:val="24"/>
+        </w:rPr>
+        <w:t>Afin d'évaluer la distribution des grades de toxicité hématologique attendus en population, une approche de simulation Monte-Carlo a été mise en œuvre. Une cohorte virtuelle de N=300 patients a été générée pour le T-DXd (5,4 mg/kg Q3W × 6 cycles), en intégrant la variabilité inter-individuelle sur les paramètres PK et PD.</w:t>
       </w:r>
     </w:p>
     <w:p>
       <w:pPr>
-        <w:spacing w:after="60"/>
-        <w:ind w:left="283" w:hanging="227"/>
-        <w:rPr>
-          <w:lang w:val="fr-FR"/>
-        </w:rPr>
-      </w:pPr>
-      <w:r>
-        <w:rPr>
-          <w:rFonts w:ascii="Times New Roman" w:hAnsi="Times New Roman"/>
-          <w:lang w:val="fr-FR"/>
-        </w:rPr>
-        <w:t xml:space="preserve">• Paramètres PK individuels simulés par tirage log-normal : CL ~ </w:t>
-      </w:r>
-      <w:proofErr w:type="spellStart"/>
-      <w:proofErr w:type="gramStart"/>
-      <w:r>
-        <w:rPr>
-          <w:rFonts w:ascii="Times New Roman" w:hAnsi="Times New Roman"/>
-          <w:lang w:val="fr-FR"/>
-        </w:rPr>
-        <w:t>LogN</w:t>
-      </w:r>
-      <w:proofErr w:type="spellEnd"/>
-      <w:r>
-        <w:rPr>
-          <w:rFonts w:ascii="Times New Roman" w:hAnsi="Times New Roman"/>
-          <w:lang w:val="fr-FR"/>
-        </w:rPr>
-        <w:t>(</w:t>
-      </w:r>
-      <w:proofErr w:type="gramEnd"/>
-      <w:r>
-        <w:rPr>
-          <w:rFonts w:ascii="Times New Roman" w:hAnsi="Times New Roman"/>
-        </w:rPr>
-        <w:t>μ</w:t>
-      </w:r>
-      <w:r>
-        <w:rPr>
-          <w:rFonts w:ascii="Times New Roman" w:hAnsi="Times New Roman"/>
-          <w:lang w:val="fr-FR"/>
-        </w:rPr>
-        <w:t xml:space="preserve">_CL, CV=30%), V1 ~ </w:t>
-      </w:r>
-      <w:proofErr w:type="spellStart"/>
-      <w:r>
-        <w:rPr>
-          <w:rFonts w:ascii="Times New Roman" w:hAnsi="Times New Roman"/>
-          <w:lang w:val="fr-FR"/>
-        </w:rPr>
-        <w:t>LogN</w:t>
-      </w:r>
-      <w:proofErr w:type="spellEnd"/>
-      <w:r>
-        <w:rPr>
-          <w:rFonts w:ascii="Times New Roman" w:hAnsi="Times New Roman"/>
-          <w:lang w:val="fr-FR"/>
-        </w:rPr>
-        <w:t>(</w:t>
-      </w:r>
-      <w:r>
-        <w:rPr>
-          <w:rFonts w:ascii="Times New Roman" w:hAnsi="Times New Roman"/>
-        </w:rPr>
-        <w:t>μ</w:t>
-      </w:r>
-      <w:r>
-        <w:rPr>
-          <w:rFonts w:ascii="Times New Roman" w:hAnsi="Times New Roman"/>
-          <w:lang w:val="fr-FR"/>
-        </w:rPr>
-        <w:t xml:space="preserve">_V1, CV=25%), Q ~ </w:t>
-      </w:r>
-      <w:proofErr w:type="spellStart"/>
-      <w:r>
-        <w:rPr>
-          <w:rFonts w:ascii="Times New Roman" w:hAnsi="Times New Roman"/>
-          <w:lang w:val="fr-FR"/>
-        </w:rPr>
-        <w:t>LogN</w:t>
-      </w:r>
-      <w:proofErr w:type="spellEnd"/>
-      <w:r>
-        <w:rPr>
-          <w:rFonts w:ascii="Times New Roman" w:hAnsi="Times New Roman"/>
-          <w:lang w:val="fr-FR"/>
-        </w:rPr>
-        <w:t>(</w:t>
-      </w:r>
-      <w:r>
-        <w:rPr>
-          <w:rFonts w:ascii="Times New Roman" w:hAnsi="Times New Roman"/>
-        </w:rPr>
-        <w:t>μ</w:t>
-      </w:r>
-      <w:r>
-        <w:rPr>
-          <w:rFonts w:ascii="Times New Roman" w:hAnsi="Times New Roman"/>
-          <w:lang w:val="fr-FR"/>
-        </w:rPr>
-        <w:t xml:space="preserve">_Q, CV=30%), V2 ~ </w:t>
-      </w:r>
-      <w:proofErr w:type="spellStart"/>
-      <w:r>
-        <w:rPr>
-          <w:rFonts w:ascii="Times New Roman" w:hAnsi="Times New Roman"/>
-          <w:lang w:val="fr-FR"/>
-        </w:rPr>
-        <w:t>LogN</w:t>
-      </w:r>
-      <w:proofErr w:type="spellEnd"/>
-      <w:r>
-        <w:rPr>
-          <w:rFonts w:ascii="Times New Roman" w:hAnsi="Times New Roman"/>
-          <w:lang w:val="fr-FR"/>
-        </w:rPr>
-        <w:t>(</w:t>
-      </w:r>
-      <w:r>
-        <w:rPr>
-          <w:rFonts w:ascii="Times New Roman" w:hAnsi="Times New Roman"/>
-        </w:rPr>
-        <w:t>μ</w:t>
-      </w:r>
-      <w:r>
-        <w:rPr>
-          <w:rFonts w:ascii="Times New Roman" w:hAnsi="Times New Roman"/>
-          <w:lang w:val="fr-FR"/>
-        </w:rPr>
-        <w:t>_V2, CV=25%)</w:t>
+        <w:jc w:val="left"/>
+        <w:spacing w:before="180" w:after="90"/>
+      </w:pPr>
+      <w:r>
+        <w:rPr>
+          <w:rFonts w:ascii="Times New Roman" w:hAnsi="Times New Roman"/>
+          <w:b/>
+          <w:color w:val="2C3E50"/>
+          <w:sz w:val="24"/>
+        </w:rPr>
+        <w:t>Modélisation de la variabilité inter-individuelle</w:t>
       </w:r>
     </w:p>
     <w:p>
       <w:pPr>
-        <w:spacing w:after="60"/>
-        <w:ind w:left="283" w:hanging="227"/>
-        <w:rPr>
-          <w:lang w:val="fr-FR"/>
-        </w:rPr>
-      </w:pPr>
-      <w:r>
-        <w:rPr>
-          <w:rFonts w:ascii="Times New Roman" w:hAnsi="Times New Roman"/>
-          <w:lang w:val="fr-FR"/>
-        </w:rPr>
-        <w:t>• Paramètres PD individuels (</w:t>
-      </w:r>
-      <w:proofErr w:type="spellStart"/>
-      <w:r>
-        <w:rPr>
-          <w:rFonts w:ascii="Times New Roman" w:hAnsi="Times New Roman"/>
-          <w:lang w:val="fr-FR"/>
-        </w:rPr>
-        <w:t>Slope</w:t>
-      </w:r>
-      <w:proofErr w:type="spellEnd"/>
-      <w:r>
-        <w:rPr>
-          <w:rFonts w:ascii="Times New Roman" w:hAnsi="Times New Roman"/>
-          <w:lang w:val="fr-FR"/>
-        </w:rPr>
-        <w:t>) simulés avec CV=20% sur les valeurs de référence calibrées</w:t>
+        <w:jc w:val="both"/>
+        <w:spacing w:after="120"/>
+      </w:pPr>
+      <w:r>
+        <w:rPr>
+          <w:rFonts w:ascii="Times New Roman" w:hAnsi="Times New Roman"/>
+          <w:sz w:val="24"/>
+        </w:rPr>
+        <w:t>Les paramètres individuels sont supposés distribués selon une loi log-normale, ce qui garantit leur positivité et est cohérent avec la distribution observée des paramètres PK en population clinique :</w:t>
       </w:r>
     </w:p>
     <w:p>
       <w:pPr>
-        <w:spacing w:after="60"/>
-        <w:ind w:left="283" w:hanging="227"/>
-        <w:rPr>
-          <w:lang w:val="fr-FR"/>
-        </w:rPr>
-      </w:pPr>
-      <w:r>
-        <w:rPr>
-          <w:rFonts w:ascii="Times New Roman" w:hAnsi="Times New Roman"/>
-          <w:lang w:val="fr-FR"/>
-        </w:rPr>
-        <w:t>• Schéma posologique : T-</w:t>
-      </w:r>
-      <w:proofErr w:type="spellStart"/>
-      <w:r>
-        <w:rPr>
-          <w:rFonts w:ascii="Times New Roman" w:hAnsi="Times New Roman"/>
-          <w:lang w:val="fr-FR"/>
-        </w:rPr>
-        <w:t>DXd</w:t>
-      </w:r>
-      <w:proofErr w:type="spellEnd"/>
-      <w:r>
-        <w:rPr>
-          <w:rFonts w:ascii="Times New Roman" w:hAnsi="Times New Roman"/>
-          <w:lang w:val="fr-FR"/>
-        </w:rPr>
-        <w:t xml:space="preserve"> 5,4 mg/kg Q3W × 6 cycles (doses aux jours 1, 22, 43, 64, 85, 106)</w:t>
+        <w:jc w:val="center"/>
+        <w:spacing w:before="60" w:after="60"/>
+      </w:pPr>
+      <w:r>
+        <w:rPr>
+          <w:rFonts w:ascii="Courier New" w:hAnsi="Courier New"/>
+          <w:i/>
+          <w:color w:val="3C3C78"/>
+          <w:sz w:val="22"/>
+        </w:rPr>
+        <w:t>θᵢ = θ_pop × exp(ηᵢ)    avec ηᵢ ~ N(0, ω²)</w:t>
       </w:r>
     </w:p>
     <w:p>
       <w:pPr>
-        <w:spacing w:after="60"/>
-        <w:ind w:left="283" w:hanging="227"/>
-        <w:rPr>
-          <w:lang w:val="fr-FR"/>
-        </w:rPr>
-      </w:pPr>
-      <w:r>
-        <w:rPr>
-          <w:rFonts w:ascii="Times New Roman" w:hAnsi="Times New Roman"/>
-          <w:lang w:val="fr-FR"/>
-        </w:rPr>
-        <w:t xml:space="preserve">• Masse corporelle individuelle simulée : </w:t>
-      </w:r>
-      <w:proofErr w:type="spellStart"/>
-      <w:proofErr w:type="gramStart"/>
-      <w:r>
-        <w:rPr>
-          <w:rFonts w:ascii="Times New Roman" w:hAnsi="Times New Roman"/>
-          <w:lang w:val="fr-FR"/>
-        </w:rPr>
-        <w:t>LogN</w:t>
-      </w:r>
-      <w:proofErr w:type="spellEnd"/>
-      <w:r>
-        <w:rPr>
-          <w:rFonts w:ascii="Times New Roman" w:hAnsi="Times New Roman"/>
-          <w:lang w:val="fr-FR"/>
-        </w:rPr>
-        <w:t>(</w:t>
-      </w:r>
-      <w:proofErr w:type="gramEnd"/>
-      <w:r>
-        <w:rPr>
-          <w:rFonts w:ascii="Times New Roman" w:hAnsi="Times New Roman"/>
-        </w:rPr>
-        <w:t>μ</w:t>
-      </w:r>
-      <w:r>
-        <w:rPr>
-          <w:rFonts w:ascii="Times New Roman" w:hAnsi="Times New Roman"/>
-          <w:lang w:val="fr-FR"/>
-        </w:rPr>
-        <w:t>=70 kg, CV=15%)</w:t>
+        <w:jc w:val="both"/>
+        <w:spacing w:after="120"/>
+      </w:pPr>
+      <w:r>
+        <w:rPr>
+          <w:rFonts w:ascii="Times New Roman" w:hAnsi="Times New Roman"/>
+          <w:sz w:val="24"/>
+        </w:rPr>
+        <w:t>où θ_pop est la valeur typique de population, ηᵢ l'effet aléatoire individuel et ω² la variance inter-individuelle. Le coefficient de variation (CV%) associé est approximé par CV% ≈ ω × 100 pour des valeurs de ω &lt; 0,5. Les valeurs retenues, issues de l'analyse de population FDA (BLA 761139) et de la littérature, sont :</w:t>
+      </w:r>
+    </w:p>
+    <w:tbl>
+      <w:tblPr>
+        <w:tblStyle w:val="Grilledutableau"/>
+        <w:tblW w:type="auto" w:w="0"/>
+        <w:tblLook w:firstColumn="1" w:firstRow="1" w:lastColumn="0" w:lastRow="0" w:noHBand="0" w:noVBand="1" w:val="04A0"/>
+      </w:tblPr>
+      <w:tblGrid>
+        <w:gridCol w:w="2280"/>
+        <w:gridCol w:w="2280"/>
+        <w:gridCol w:w="2280"/>
+        <w:gridCol w:w="2280"/>
+      </w:tblGrid>
+      <w:tr>
+        <w:tc>
+          <w:tcPr>
+            <w:tcW w:type="dxa" w:w="2280"/>
+            <w:shd w:val="clear" w:color="auto" w:fill="2C3E50"/>
+            <w:tcBorders>
+              <w:top w:val="single" w:sz="4" w:space="0" w:color="000000"/>
+              <w:left w:val="single" w:sz="4" w:space="0" w:color="000000"/>
+              <w:bottom w:val="single" w:sz="4" w:space="0" w:color="000000"/>
+              <w:right w:val="single" w:sz="4" w:space="0" w:color="000000"/>
+            </w:tcBorders>
+          </w:tcPr>
+          <w:p>
+            <w:pPr>
+              <w:jc w:val="center"/>
+            </w:pPr>
+            <w:r>
+              <w:rPr>
+                <w:rFonts w:ascii="Times New Roman" w:hAnsi="Times New Roman"/>
+                <w:b/>
+                <w:color w:val="FFFFFF"/>
+                <w:sz w:val="22"/>
+              </w:rPr>
+              <w:t>Paramètre</w:t>
+            </w:r>
+          </w:p>
+        </w:tc>
+        <w:tc>
+          <w:tcPr>
+            <w:tcW w:type="dxa" w:w="2280"/>
+            <w:shd w:val="clear" w:color="auto" w:fill="2C3E50"/>
+            <w:tcBorders>
+              <w:top w:val="single" w:sz="4" w:space="0" w:color="000000"/>
+              <w:left w:val="single" w:sz="4" w:space="0" w:color="000000"/>
+              <w:bottom w:val="single" w:sz="4" w:space="0" w:color="000000"/>
+              <w:right w:val="single" w:sz="4" w:space="0" w:color="000000"/>
+            </w:tcBorders>
+          </w:tcPr>
+          <w:p>
+            <w:pPr>
+              <w:jc w:val="center"/>
+            </w:pPr>
+            <w:r>
+              <w:rPr>
+                <w:rFonts w:ascii="Times New Roman" w:hAnsi="Times New Roman"/>
+                <w:b/>
+                <w:color w:val="FFFFFF"/>
+                <w:sz w:val="22"/>
+              </w:rPr>
+              <w:t>Valeur typique (θ_pop)</w:t>
+            </w:r>
+          </w:p>
+        </w:tc>
+        <w:tc>
+          <w:tcPr>
+            <w:tcW w:type="dxa" w:w="2280"/>
+            <w:shd w:val="clear" w:color="auto" w:fill="2C3E50"/>
+            <w:tcBorders>
+              <w:top w:val="single" w:sz="4" w:space="0" w:color="000000"/>
+              <w:left w:val="single" w:sz="4" w:space="0" w:color="000000"/>
+              <w:bottom w:val="single" w:sz="4" w:space="0" w:color="000000"/>
+              <w:right w:val="single" w:sz="4" w:space="0" w:color="000000"/>
+            </w:tcBorders>
+          </w:tcPr>
+          <w:p>
+            <w:pPr>
+              <w:jc w:val="center"/>
+            </w:pPr>
+            <w:r>
+              <w:rPr>
+                <w:rFonts w:ascii="Times New Roman" w:hAnsi="Times New Roman"/>
+                <w:b/>
+                <w:color w:val="FFFFFF"/>
+                <w:sz w:val="22"/>
+              </w:rPr>
+              <w:t>CV inter-individuel (ω)</w:t>
+            </w:r>
+          </w:p>
+        </w:tc>
+        <w:tc>
+          <w:tcPr>
+            <w:tcW w:type="dxa" w:w="2280"/>
+            <w:shd w:val="clear" w:color="auto" w:fill="2C3E50"/>
+            <w:tcBorders>
+              <w:top w:val="single" w:sz="4" w:space="0" w:color="000000"/>
+              <w:left w:val="single" w:sz="4" w:space="0" w:color="000000"/>
+              <w:bottom w:val="single" w:sz="4" w:space="0" w:color="000000"/>
+              <w:right w:val="single" w:sz="4" w:space="0" w:color="000000"/>
+            </w:tcBorders>
+          </w:tcPr>
+          <w:p>
+            <w:pPr>
+              <w:jc w:val="center"/>
+            </w:pPr>
+            <w:r>
+              <w:rPr>
+                <w:rFonts w:ascii="Times New Roman" w:hAnsi="Times New Roman"/>
+                <w:b/>
+                <w:color w:val="FFFFFF"/>
+                <w:sz w:val="22"/>
+              </w:rPr>
+              <w:t>Source</w:t>
+            </w:r>
+          </w:p>
+        </w:tc>
+      </w:tr>
+      <w:tr>
+        <w:tc>
+          <w:tcPr>
+            <w:tcW w:type="dxa" w:w="2280"/>
+            <w:shd w:val="clear" w:color="auto" w:fill="F2F2F2"/>
+            <w:tcBorders>
+              <w:top w:val="single" w:sz="4" w:space="0" w:color="000000"/>
+              <w:left w:val="single" w:sz="4" w:space="0" w:color="000000"/>
+              <w:bottom w:val="single" w:sz="4" w:space="0" w:color="000000"/>
+              <w:right w:val="single" w:sz="4" w:space="0" w:color="000000"/>
+            </w:tcBorders>
+          </w:tcPr>
+          <w:p>
+            <w:pPr>
+              <w:jc w:val="left"/>
+            </w:pPr>
+            <w:r>
+              <w:rPr>
+                <w:rFonts w:ascii="Times New Roman" w:hAnsi="Times New Roman"/>
+                <w:color w:val="000000"/>
+                <w:sz w:val="22"/>
+              </w:rPr>
+              <w:t>CL (L/h)</w:t>
+            </w:r>
+          </w:p>
+        </w:tc>
+        <w:tc>
+          <w:tcPr>
+            <w:tcW w:type="dxa" w:w="2280"/>
+            <w:shd w:val="clear" w:color="auto" w:fill="F2F2F2"/>
+            <w:tcBorders>
+              <w:top w:val="single" w:sz="4" w:space="0" w:color="000000"/>
+              <w:left w:val="single" w:sz="4" w:space="0" w:color="000000"/>
+              <w:bottom w:val="single" w:sz="4" w:space="0" w:color="000000"/>
+              <w:right w:val="single" w:sz="4" w:space="0" w:color="000000"/>
+            </w:tcBorders>
+          </w:tcPr>
+          <w:p>
+            <w:pPr>
+              <w:jc w:val="center"/>
+            </w:pPr>
+            <w:r>
+              <w:rPr>
+                <w:rFonts w:ascii="Times New Roman" w:hAnsi="Times New Roman"/>
+                <w:color w:val="000000"/>
+                <w:sz w:val="22"/>
+              </w:rPr>
+              <w:t>0,50</w:t>
+            </w:r>
+          </w:p>
+        </w:tc>
+        <w:tc>
+          <w:tcPr>
+            <w:tcW w:type="dxa" w:w="2280"/>
+            <w:shd w:val="clear" w:color="auto" w:fill="F2F2F2"/>
+            <w:tcBorders>
+              <w:top w:val="single" w:sz="4" w:space="0" w:color="000000"/>
+              <w:left w:val="single" w:sz="4" w:space="0" w:color="000000"/>
+              <w:bottom w:val="single" w:sz="4" w:space="0" w:color="000000"/>
+              <w:right w:val="single" w:sz="4" w:space="0" w:color="000000"/>
+            </w:tcBorders>
+          </w:tcPr>
+          <w:p>
+            <w:pPr>
+              <w:jc w:val="center"/>
+            </w:pPr>
+            <w:r>
+              <w:rPr>
+                <w:rFonts w:ascii="Times New Roman" w:hAnsi="Times New Roman"/>
+                <w:color w:val="000000"/>
+                <w:sz w:val="22"/>
+              </w:rPr>
+              <w:t>30%</w:t>
+            </w:r>
+          </w:p>
+        </w:tc>
+        <w:tc>
+          <w:tcPr>
+            <w:tcW w:type="dxa" w:w="2280"/>
+            <w:shd w:val="clear" w:color="auto" w:fill="F2F2F2"/>
+            <w:tcBorders>
+              <w:top w:val="single" w:sz="4" w:space="0" w:color="000000"/>
+              <w:left w:val="single" w:sz="4" w:space="0" w:color="000000"/>
+              <w:bottom w:val="single" w:sz="4" w:space="0" w:color="000000"/>
+              <w:right w:val="single" w:sz="4" w:space="0" w:color="000000"/>
+            </w:tcBorders>
+          </w:tcPr>
+          <w:p>
+            <w:pPr>
+              <w:jc w:val="center"/>
+            </w:pPr>
+            <w:r>
+              <w:rPr>
+                <w:rFonts w:ascii="Times New Roman" w:hAnsi="Times New Roman"/>
+                <w:color w:val="000000"/>
+                <w:sz w:val="22"/>
+              </w:rPr>
+              <w:t>FDA BLA 761139</w:t>
+            </w:r>
+          </w:p>
+        </w:tc>
+      </w:tr>
+      <w:tr>
+        <w:tc>
+          <w:tcPr>
+            <w:tcW w:type="dxa" w:w="2280"/>
+            <w:shd w:val="clear" w:color="auto" w:fill="FFFFFF"/>
+            <w:tcBorders>
+              <w:top w:val="single" w:sz="4" w:space="0" w:color="000000"/>
+              <w:left w:val="single" w:sz="4" w:space="0" w:color="000000"/>
+              <w:bottom w:val="single" w:sz="4" w:space="0" w:color="000000"/>
+              <w:right w:val="single" w:sz="4" w:space="0" w:color="000000"/>
+            </w:tcBorders>
+          </w:tcPr>
+          <w:p>
+            <w:pPr>
+              <w:jc w:val="left"/>
+            </w:pPr>
+            <w:r>
+              <w:rPr>
+                <w:rFonts w:ascii="Times New Roman" w:hAnsi="Times New Roman"/>
+                <w:color w:val="000000"/>
+                <w:sz w:val="22"/>
+              </w:rPr>
+              <w:t>V1 (L)</w:t>
+            </w:r>
+          </w:p>
+        </w:tc>
+        <w:tc>
+          <w:tcPr>
+            <w:tcW w:type="dxa" w:w="2280"/>
+            <w:shd w:val="clear" w:color="auto" w:fill="FFFFFF"/>
+            <w:tcBorders>
+              <w:top w:val="single" w:sz="4" w:space="0" w:color="000000"/>
+              <w:left w:val="single" w:sz="4" w:space="0" w:color="000000"/>
+              <w:bottom w:val="single" w:sz="4" w:space="0" w:color="000000"/>
+              <w:right w:val="single" w:sz="4" w:space="0" w:color="000000"/>
+            </w:tcBorders>
+          </w:tcPr>
+          <w:p>
+            <w:pPr>
+              <w:jc w:val="center"/>
+            </w:pPr>
+            <w:r>
+              <w:rPr>
+                <w:rFonts w:ascii="Times New Roman" w:hAnsi="Times New Roman"/>
+                <w:color w:val="000000"/>
+                <w:sz w:val="22"/>
+              </w:rPr>
+              <w:t>3,1</w:t>
+            </w:r>
+          </w:p>
+        </w:tc>
+        <w:tc>
+          <w:tcPr>
+            <w:tcW w:type="dxa" w:w="2280"/>
+            <w:shd w:val="clear" w:color="auto" w:fill="FFFFFF"/>
+            <w:tcBorders>
+              <w:top w:val="single" w:sz="4" w:space="0" w:color="000000"/>
+              <w:left w:val="single" w:sz="4" w:space="0" w:color="000000"/>
+              <w:bottom w:val="single" w:sz="4" w:space="0" w:color="000000"/>
+              <w:right w:val="single" w:sz="4" w:space="0" w:color="000000"/>
+            </w:tcBorders>
+          </w:tcPr>
+          <w:p>
+            <w:pPr>
+              <w:jc w:val="center"/>
+            </w:pPr>
+            <w:r>
+              <w:rPr>
+                <w:rFonts w:ascii="Times New Roman" w:hAnsi="Times New Roman"/>
+                <w:color w:val="000000"/>
+                <w:sz w:val="22"/>
+              </w:rPr>
+              <w:t>25%</w:t>
+            </w:r>
+          </w:p>
+        </w:tc>
+        <w:tc>
+          <w:tcPr>
+            <w:tcW w:type="dxa" w:w="2280"/>
+            <w:shd w:val="clear" w:color="auto" w:fill="FFFFFF"/>
+            <w:tcBorders>
+              <w:top w:val="single" w:sz="4" w:space="0" w:color="000000"/>
+              <w:left w:val="single" w:sz="4" w:space="0" w:color="000000"/>
+              <w:bottom w:val="single" w:sz="4" w:space="0" w:color="000000"/>
+              <w:right w:val="single" w:sz="4" w:space="0" w:color="000000"/>
+            </w:tcBorders>
+          </w:tcPr>
+          <w:p>
+            <w:pPr>
+              <w:jc w:val="center"/>
+            </w:pPr>
+            <w:r>
+              <w:rPr>
+                <w:rFonts w:ascii="Times New Roman" w:hAnsi="Times New Roman"/>
+                <w:color w:val="000000"/>
+                <w:sz w:val="22"/>
+              </w:rPr>
+              <w:t>FDA BLA 761139</w:t>
+            </w:r>
+          </w:p>
+        </w:tc>
+      </w:tr>
+      <w:tr>
+        <w:tc>
+          <w:tcPr>
+            <w:tcW w:type="dxa" w:w="2280"/>
+            <w:shd w:val="clear" w:color="auto" w:fill="F2F2F2"/>
+            <w:tcBorders>
+              <w:top w:val="single" w:sz="4" w:space="0" w:color="000000"/>
+              <w:left w:val="single" w:sz="4" w:space="0" w:color="000000"/>
+              <w:bottom w:val="single" w:sz="4" w:space="0" w:color="000000"/>
+              <w:right w:val="single" w:sz="4" w:space="0" w:color="000000"/>
+            </w:tcBorders>
+          </w:tcPr>
+          <w:p>
+            <w:pPr>
+              <w:jc w:val="left"/>
+            </w:pPr>
+            <w:r>
+              <w:rPr>
+                <w:rFonts w:ascii="Times New Roman" w:hAnsi="Times New Roman"/>
+                <w:color w:val="000000"/>
+                <w:sz w:val="22"/>
+              </w:rPr>
+              <w:t>Q (L/h)</w:t>
+            </w:r>
+          </w:p>
+        </w:tc>
+        <w:tc>
+          <w:tcPr>
+            <w:tcW w:type="dxa" w:w="2280"/>
+            <w:shd w:val="clear" w:color="auto" w:fill="F2F2F2"/>
+            <w:tcBorders>
+              <w:top w:val="single" w:sz="4" w:space="0" w:color="000000"/>
+              <w:left w:val="single" w:sz="4" w:space="0" w:color="000000"/>
+              <w:bottom w:val="single" w:sz="4" w:space="0" w:color="000000"/>
+              <w:right w:val="single" w:sz="4" w:space="0" w:color="000000"/>
+            </w:tcBorders>
+          </w:tcPr>
+          <w:p>
+            <w:pPr>
+              <w:jc w:val="center"/>
+            </w:pPr>
+            <w:r>
+              <w:rPr>
+                <w:rFonts w:ascii="Times New Roman" w:hAnsi="Times New Roman"/>
+                <w:color w:val="000000"/>
+                <w:sz w:val="22"/>
+              </w:rPr>
+              <w:t>0,80</w:t>
+            </w:r>
+          </w:p>
+        </w:tc>
+        <w:tc>
+          <w:tcPr>
+            <w:tcW w:type="dxa" w:w="2280"/>
+            <w:shd w:val="clear" w:color="auto" w:fill="F2F2F2"/>
+            <w:tcBorders>
+              <w:top w:val="single" w:sz="4" w:space="0" w:color="000000"/>
+              <w:left w:val="single" w:sz="4" w:space="0" w:color="000000"/>
+              <w:bottom w:val="single" w:sz="4" w:space="0" w:color="000000"/>
+              <w:right w:val="single" w:sz="4" w:space="0" w:color="000000"/>
+            </w:tcBorders>
+          </w:tcPr>
+          <w:p>
+            <w:pPr>
+              <w:jc w:val="center"/>
+            </w:pPr>
+            <w:r>
+              <w:rPr>
+                <w:rFonts w:ascii="Times New Roman" w:hAnsi="Times New Roman"/>
+                <w:color w:val="000000"/>
+                <w:sz w:val="22"/>
+              </w:rPr>
+              <w:t>30%</w:t>
+            </w:r>
+          </w:p>
+        </w:tc>
+        <w:tc>
+          <w:tcPr>
+            <w:tcW w:type="dxa" w:w="2280"/>
+            <w:shd w:val="clear" w:color="auto" w:fill="F2F2F2"/>
+            <w:tcBorders>
+              <w:top w:val="single" w:sz="4" w:space="0" w:color="000000"/>
+              <w:left w:val="single" w:sz="4" w:space="0" w:color="000000"/>
+              <w:bottom w:val="single" w:sz="4" w:space="0" w:color="000000"/>
+              <w:right w:val="single" w:sz="4" w:space="0" w:color="000000"/>
+            </w:tcBorders>
+          </w:tcPr>
+          <w:p>
+            <w:pPr>
+              <w:jc w:val="center"/>
+            </w:pPr>
+            <w:r>
+              <w:rPr>
+                <w:rFonts w:ascii="Times New Roman" w:hAnsi="Times New Roman"/>
+                <w:color w:val="000000"/>
+                <w:sz w:val="22"/>
+              </w:rPr>
+              <w:t>FDA BLA 761139</w:t>
+            </w:r>
+          </w:p>
+        </w:tc>
+      </w:tr>
+      <w:tr>
+        <w:tc>
+          <w:tcPr>
+            <w:tcW w:type="dxa" w:w="2280"/>
+            <w:shd w:val="clear" w:color="auto" w:fill="FFFFFF"/>
+            <w:tcBorders>
+              <w:top w:val="single" w:sz="4" w:space="0" w:color="000000"/>
+              <w:left w:val="single" w:sz="4" w:space="0" w:color="000000"/>
+              <w:bottom w:val="single" w:sz="4" w:space="0" w:color="000000"/>
+              <w:right w:val="single" w:sz="4" w:space="0" w:color="000000"/>
+            </w:tcBorders>
+          </w:tcPr>
+          <w:p>
+            <w:pPr>
+              <w:jc w:val="left"/>
+            </w:pPr>
+            <w:r>
+              <w:rPr>
+                <w:rFonts w:ascii="Times New Roman" w:hAnsi="Times New Roman"/>
+                <w:color w:val="000000"/>
+                <w:sz w:val="22"/>
+              </w:rPr>
+              <w:t>V2 (L)</w:t>
+            </w:r>
+          </w:p>
+        </w:tc>
+        <w:tc>
+          <w:tcPr>
+            <w:tcW w:type="dxa" w:w="2280"/>
+            <w:shd w:val="clear" w:color="auto" w:fill="FFFFFF"/>
+            <w:tcBorders>
+              <w:top w:val="single" w:sz="4" w:space="0" w:color="000000"/>
+              <w:left w:val="single" w:sz="4" w:space="0" w:color="000000"/>
+              <w:bottom w:val="single" w:sz="4" w:space="0" w:color="000000"/>
+              <w:right w:val="single" w:sz="4" w:space="0" w:color="000000"/>
+            </w:tcBorders>
+          </w:tcPr>
+          <w:p>
+            <w:pPr>
+              <w:jc w:val="center"/>
+            </w:pPr>
+            <w:r>
+              <w:rPr>
+                <w:rFonts w:ascii="Times New Roman" w:hAnsi="Times New Roman"/>
+                <w:color w:val="000000"/>
+                <w:sz w:val="22"/>
+              </w:rPr>
+              <w:t>2,5</w:t>
+            </w:r>
+          </w:p>
+        </w:tc>
+        <w:tc>
+          <w:tcPr>
+            <w:tcW w:type="dxa" w:w="2280"/>
+            <w:shd w:val="clear" w:color="auto" w:fill="FFFFFF"/>
+            <w:tcBorders>
+              <w:top w:val="single" w:sz="4" w:space="0" w:color="000000"/>
+              <w:left w:val="single" w:sz="4" w:space="0" w:color="000000"/>
+              <w:bottom w:val="single" w:sz="4" w:space="0" w:color="000000"/>
+              <w:right w:val="single" w:sz="4" w:space="0" w:color="000000"/>
+            </w:tcBorders>
+          </w:tcPr>
+          <w:p>
+            <w:pPr>
+              <w:jc w:val="center"/>
+            </w:pPr>
+            <w:r>
+              <w:rPr>
+                <w:rFonts w:ascii="Times New Roman" w:hAnsi="Times New Roman"/>
+                <w:color w:val="000000"/>
+                <w:sz w:val="22"/>
+              </w:rPr>
+              <w:t>25%</w:t>
+            </w:r>
+          </w:p>
+        </w:tc>
+        <w:tc>
+          <w:tcPr>
+            <w:tcW w:type="dxa" w:w="2280"/>
+            <w:shd w:val="clear" w:color="auto" w:fill="FFFFFF"/>
+            <w:tcBorders>
+              <w:top w:val="single" w:sz="4" w:space="0" w:color="000000"/>
+              <w:left w:val="single" w:sz="4" w:space="0" w:color="000000"/>
+              <w:bottom w:val="single" w:sz="4" w:space="0" w:color="000000"/>
+              <w:right w:val="single" w:sz="4" w:space="0" w:color="000000"/>
+            </w:tcBorders>
+          </w:tcPr>
+          <w:p>
+            <w:pPr>
+              <w:jc w:val="center"/>
+            </w:pPr>
+            <w:r>
+              <w:rPr>
+                <w:rFonts w:ascii="Times New Roman" w:hAnsi="Times New Roman"/>
+                <w:color w:val="000000"/>
+                <w:sz w:val="22"/>
+              </w:rPr>
+              <w:t>FDA BLA 761139</w:t>
+            </w:r>
+          </w:p>
+        </w:tc>
+      </w:tr>
+      <w:tr>
+        <w:tc>
+          <w:tcPr>
+            <w:tcW w:type="dxa" w:w="2280"/>
+            <w:shd w:val="clear" w:color="auto" w:fill="F2F2F2"/>
+            <w:tcBorders>
+              <w:top w:val="single" w:sz="4" w:space="0" w:color="000000"/>
+              <w:left w:val="single" w:sz="4" w:space="0" w:color="000000"/>
+              <w:bottom w:val="single" w:sz="4" w:space="0" w:color="000000"/>
+              <w:right w:val="single" w:sz="4" w:space="0" w:color="000000"/>
+            </w:tcBorders>
+          </w:tcPr>
+          <w:p>
+            <w:pPr>
+              <w:jc w:val="left"/>
+            </w:pPr>
+            <w:r>
+              <w:rPr>
+                <w:rFonts w:ascii="Times New Roman" w:hAnsi="Times New Roman"/>
+                <w:color w:val="000000"/>
+                <w:sz w:val="22"/>
+              </w:rPr>
+              <w:t>Slope_MPP (µM⁻¹)</w:t>
+            </w:r>
+          </w:p>
+        </w:tc>
+        <w:tc>
+          <w:tcPr>
+            <w:tcW w:type="dxa" w:w="2280"/>
+            <w:shd w:val="clear" w:color="auto" w:fill="F2F2F2"/>
+            <w:tcBorders>
+              <w:top w:val="single" w:sz="4" w:space="0" w:color="000000"/>
+              <w:left w:val="single" w:sz="4" w:space="0" w:color="000000"/>
+              <w:bottom w:val="single" w:sz="4" w:space="0" w:color="000000"/>
+              <w:right w:val="single" w:sz="4" w:space="0" w:color="000000"/>
+            </w:tcBorders>
+          </w:tcPr>
+          <w:p>
+            <w:pPr>
+              <w:jc w:val="center"/>
+            </w:pPr>
+            <w:r>
+              <w:rPr>
+                <w:rFonts w:ascii="Times New Roman" w:hAnsi="Times New Roman"/>
+                <w:color w:val="000000"/>
+                <w:sz w:val="22"/>
+              </w:rPr>
+              <w:t>—</w:t>
+            </w:r>
+          </w:p>
+        </w:tc>
+        <w:tc>
+          <w:tcPr>
+            <w:tcW w:type="dxa" w:w="2280"/>
+            <w:shd w:val="clear" w:color="auto" w:fill="F2F2F2"/>
+            <w:tcBorders>
+              <w:top w:val="single" w:sz="4" w:space="0" w:color="000000"/>
+              <w:left w:val="single" w:sz="4" w:space="0" w:color="000000"/>
+              <w:bottom w:val="single" w:sz="4" w:space="0" w:color="000000"/>
+              <w:right w:val="single" w:sz="4" w:space="0" w:color="000000"/>
+            </w:tcBorders>
+          </w:tcPr>
+          <w:p>
+            <w:pPr>
+              <w:jc w:val="center"/>
+            </w:pPr>
+            <w:r>
+              <w:rPr>
+                <w:rFonts w:ascii="Times New Roman" w:hAnsi="Times New Roman"/>
+                <w:color w:val="000000"/>
+                <w:sz w:val="22"/>
+              </w:rPr>
+              <w:t>20%</w:t>
+            </w:r>
+          </w:p>
+        </w:tc>
+        <w:tc>
+          <w:tcPr>
+            <w:tcW w:type="dxa" w:w="2280"/>
+            <w:shd w:val="clear" w:color="auto" w:fill="F2F2F2"/>
+            <w:tcBorders>
+              <w:top w:val="single" w:sz="4" w:space="0" w:color="000000"/>
+              <w:left w:val="single" w:sz="4" w:space="0" w:color="000000"/>
+              <w:bottom w:val="single" w:sz="4" w:space="0" w:color="000000"/>
+              <w:right w:val="single" w:sz="4" w:space="0" w:color="000000"/>
+            </w:tcBorders>
+          </w:tcPr>
+          <w:p>
+            <w:pPr>
+              <w:jc w:val="center"/>
+            </w:pPr>
+            <w:r>
+              <w:rPr>
+                <w:rFonts w:ascii="Times New Roman" w:hAnsi="Times New Roman"/>
+                <w:color w:val="000000"/>
+                <w:sz w:val="22"/>
+              </w:rPr>
+              <w:t>Calibration rat</w:t>
+            </w:r>
+          </w:p>
+        </w:tc>
+      </w:tr>
+      <w:tr>
+        <w:tc>
+          <w:tcPr>
+            <w:tcW w:type="dxa" w:w="2280"/>
+            <w:shd w:val="clear" w:color="auto" w:fill="FFFFFF"/>
+            <w:tcBorders>
+              <w:top w:val="single" w:sz="4" w:space="0" w:color="000000"/>
+              <w:left w:val="single" w:sz="4" w:space="0" w:color="000000"/>
+              <w:bottom w:val="single" w:sz="4" w:space="0" w:color="000000"/>
+              <w:right w:val="single" w:sz="4" w:space="0" w:color="000000"/>
+            </w:tcBorders>
+          </w:tcPr>
+          <w:p>
+            <w:pPr>
+              <w:jc w:val="left"/>
+            </w:pPr>
+            <w:r>
+              <w:rPr>
+                <w:rFonts w:ascii="Times New Roman" w:hAnsi="Times New Roman"/>
+                <w:color w:val="000000"/>
+                <w:sz w:val="22"/>
+              </w:rPr>
+              <w:t>Slope_CMP (µM⁻¹)</w:t>
+            </w:r>
+          </w:p>
+        </w:tc>
+        <w:tc>
+          <w:tcPr>
+            <w:tcW w:type="dxa" w:w="2280"/>
+            <w:shd w:val="clear" w:color="auto" w:fill="FFFFFF"/>
+            <w:tcBorders>
+              <w:top w:val="single" w:sz="4" w:space="0" w:color="000000"/>
+              <w:left w:val="single" w:sz="4" w:space="0" w:color="000000"/>
+              <w:bottom w:val="single" w:sz="4" w:space="0" w:color="000000"/>
+              <w:right w:val="single" w:sz="4" w:space="0" w:color="000000"/>
+            </w:tcBorders>
+          </w:tcPr>
+          <w:p>
+            <w:pPr>
+              <w:jc w:val="center"/>
+            </w:pPr>
+            <w:r>
+              <w:rPr>
+                <w:rFonts w:ascii="Times New Roman" w:hAnsi="Times New Roman"/>
+                <w:color w:val="000000"/>
+                <w:sz w:val="22"/>
+              </w:rPr>
+              <w:t>—</w:t>
+            </w:r>
+          </w:p>
+        </w:tc>
+        <w:tc>
+          <w:tcPr>
+            <w:tcW w:type="dxa" w:w="2280"/>
+            <w:shd w:val="clear" w:color="auto" w:fill="FFFFFF"/>
+            <w:tcBorders>
+              <w:top w:val="single" w:sz="4" w:space="0" w:color="000000"/>
+              <w:left w:val="single" w:sz="4" w:space="0" w:color="000000"/>
+              <w:bottom w:val="single" w:sz="4" w:space="0" w:color="000000"/>
+              <w:right w:val="single" w:sz="4" w:space="0" w:color="000000"/>
+            </w:tcBorders>
+          </w:tcPr>
+          <w:p>
+            <w:pPr>
+              <w:jc w:val="center"/>
+            </w:pPr>
+            <w:r>
+              <w:rPr>
+                <w:rFonts w:ascii="Times New Roman" w:hAnsi="Times New Roman"/>
+                <w:color w:val="000000"/>
+                <w:sz w:val="22"/>
+              </w:rPr>
+              <w:t>20%</w:t>
+            </w:r>
+          </w:p>
+        </w:tc>
+        <w:tc>
+          <w:tcPr>
+            <w:tcW w:type="dxa" w:w="2280"/>
+            <w:shd w:val="clear" w:color="auto" w:fill="FFFFFF"/>
+            <w:tcBorders>
+              <w:top w:val="single" w:sz="4" w:space="0" w:color="000000"/>
+              <w:left w:val="single" w:sz="4" w:space="0" w:color="000000"/>
+              <w:bottom w:val="single" w:sz="4" w:space="0" w:color="000000"/>
+              <w:right w:val="single" w:sz="4" w:space="0" w:color="000000"/>
+            </w:tcBorders>
+          </w:tcPr>
+          <w:p>
+            <w:pPr>
+              <w:jc w:val="center"/>
+            </w:pPr>
+            <w:r>
+              <w:rPr>
+                <w:rFonts w:ascii="Times New Roman" w:hAnsi="Times New Roman"/>
+                <w:color w:val="000000"/>
+                <w:sz w:val="22"/>
+              </w:rPr>
+              <w:t>Calibration rat</w:t>
+            </w:r>
+          </w:p>
+        </w:tc>
+      </w:tr>
+      <w:tr>
+        <w:tc>
+          <w:tcPr>
+            <w:tcW w:type="dxa" w:w="2280"/>
+            <w:shd w:val="clear" w:color="auto" w:fill="F2F2F2"/>
+            <w:tcBorders>
+              <w:top w:val="single" w:sz="4" w:space="0" w:color="000000"/>
+              <w:left w:val="single" w:sz="4" w:space="0" w:color="000000"/>
+              <w:bottom w:val="single" w:sz="4" w:space="0" w:color="000000"/>
+              <w:right w:val="single" w:sz="4" w:space="0" w:color="000000"/>
+            </w:tcBorders>
+          </w:tcPr>
+          <w:p>
+            <w:pPr>
+              <w:jc w:val="left"/>
+            </w:pPr>
+            <w:r>
+              <w:rPr>
+                <w:rFonts w:ascii="Times New Roman" w:hAnsi="Times New Roman"/>
+                <w:color w:val="000000"/>
+                <w:sz w:val="22"/>
+              </w:rPr>
+              <w:t>Slope_MEP (µM⁻¹)</w:t>
+            </w:r>
+          </w:p>
+        </w:tc>
+        <w:tc>
+          <w:tcPr>
+            <w:tcW w:type="dxa" w:w="2280"/>
+            <w:shd w:val="clear" w:color="auto" w:fill="F2F2F2"/>
+            <w:tcBorders>
+              <w:top w:val="single" w:sz="4" w:space="0" w:color="000000"/>
+              <w:left w:val="single" w:sz="4" w:space="0" w:color="000000"/>
+              <w:bottom w:val="single" w:sz="4" w:space="0" w:color="000000"/>
+              <w:right w:val="single" w:sz="4" w:space="0" w:color="000000"/>
+            </w:tcBorders>
+          </w:tcPr>
+          <w:p>
+            <w:pPr>
+              <w:jc w:val="center"/>
+            </w:pPr>
+            <w:r>
+              <w:rPr>
+                <w:rFonts w:ascii="Times New Roman" w:hAnsi="Times New Roman"/>
+                <w:color w:val="000000"/>
+                <w:sz w:val="22"/>
+              </w:rPr>
+              <w:t>—</w:t>
+            </w:r>
+          </w:p>
+        </w:tc>
+        <w:tc>
+          <w:tcPr>
+            <w:tcW w:type="dxa" w:w="2280"/>
+            <w:shd w:val="clear" w:color="auto" w:fill="F2F2F2"/>
+            <w:tcBorders>
+              <w:top w:val="single" w:sz="4" w:space="0" w:color="000000"/>
+              <w:left w:val="single" w:sz="4" w:space="0" w:color="000000"/>
+              <w:bottom w:val="single" w:sz="4" w:space="0" w:color="000000"/>
+              <w:right w:val="single" w:sz="4" w:space="0" w:color="000000"/>
+            </w:tcBorders>
+          </w:tcPr>
+          <w:p>
+            <w:pPr>
+              <w:jc w:val="center"/>
+            </w:pPr>
+            <w:r>
+              <w:rPr>
+                <w:rFonts w:ascii="Times New Roman" w:hAnsi="Times New Roman"/>
+                <w:color w:val="000000"/>
+                <w:sz w:val="22"/>
+              </w:rPr>
+              <w:t>20%</w:t>
+            </w:r>
+          </w:p>
+        </w:tc>
+        <w:tc>
+          <w:tcPr>
+            <w:tcW w:type="dxa" w:w="2280"/>
+            <w:shd w:val="clear" w:color="auto" w:fill="F2F2F2"/>
+            <w:tcBorders>
+              <w:top w:val="single" w:sz="4" w:space="0" w:color="000000"/>
+              <w:left w:val="single" w:sz="4" w:space="0" w:color="000000"/>
+              <w:bottom w:val="single" w:sz="4" w:space="0" w:color="000000"/>
+              <w:right w:val="single" w:sz="4" w:space="0" w:color="000000"/>
+            </w:tcBorders>
+          </w:tcPr>
+          <w:p>
+            <w:pPr>
+              <w:jc w:val="center"/>
+            </w:pPr>
+            <w:r>
+              <w:rPr>
+                <w:rFonts w:ascii="Times New Roman" w:hAnsi="Times New Roman"/>
+                <w:color w:val="000000"/>
+                <w:sz w:val="22"/>
+              </w:rPr>
+              <w:t>Calibration rat</w:t>
+            </w:r>
+          </w:p>
+        </w:tc>
+      </w:tr>
+      <w:tr>
+        <w:tc>
+          <w:tcPr>
+            <w:tcW w:type="dxa" w:w="2280"/>
+            <w:shd w:val="clear" w:color="auto" w:fill="FFFFFF"/>
+            <w:tcBorders>
+              <w:top w:val="single" w:sz="4" w:space="0" w:color="000000"/>
+              <w:left w:val="single" w:sz="4" w:space="0" w:color="000000"/>
+              <w:bottom w:val="single" w:sz="4" w:space="0" w:color="000000"/>
+              <w:right w:val="single" w:sz="4" w:space="0" w:color="000000"/>
+            </w:tcBorders>
+          </w:tcPr>
+          <w:p>
+            <w:pPr>
+              <w:jc w:val="left"/>
+            </w:pPr>
+            <w:r>
+              <w:rPr>
+                <w:rFonts w:ascii="Times New Roman" w:hAnsi="Times New Roman"/>
+                <w:color w:val="000000"/>
+                <w:sz w:val="22"/>
+              </w:rPr>
+              <w:t>Poids corporel (kg)</w:t>
+            </w:r>
+          </w:p>
+        </w:tc>
+        <w:tc>
+          <w:tcPr>
+            <w:tcW w:type="dxa" w:w="2280"/>
+            <w:shd w:val="clear" w:color="auto" w:fill="FFFFFF"/>
+            <w:tcBorders>
+              <w:top w:val="single" w:sz="4" w:space="0" w:color="000000"/>
+              <w:left w:val="single" w:sz="4" w:space="0" w:color="000000"/>
+              <w:bottom w:val="single" w:sz="4" w:space="0" w:color="000000"/>
+              <w:right w:val="single" w:sz="4" w:space="0" w:color="000000"/>
+            </w:tcBorders>
+          </w:tcPr>
+          <w:p>
+            <w:pPr>
+              <w:jc w:val="center"/>
+            </w:pPr>
+            <w:r>
+              <w:rPr>
+                <w:rFonts w:ascii="Times New Roman" w:hAnsi="Times New Roman"/>
+                <w:color w:val="000000"/>
+                <w:sz w:val="22"/>
+              </w:rPr>
+              <w:t>70,0</w:t>
+            </w:r>
+          </w:p>
+        </w:tc>
+        <w:tc>
+          <w:tcPr>
+            <w:tcW w:type="dxa" w:w="2280"/>
+            <w:shd w:val="clear" w:color="auto" w:fill="FFFFFF"/>
+            <w:tcBorders>
+              <w:top w:val="single" w:sz="4" w:space="0" w:color="000000"/>
+              <w:left w:val="single" w:sz="4" w:space="0" w:color="000000"/>
+              <w:bottom w:val="single" w:sz="4" w:space="0" w:color="000000"/>
+              <w:right w:val="single" w:sz="4" w:space="0" w:color="000000"/>
+            </w:tcBorders>
+          </w:tcPr>
+          <w:p>
+            <w:pPr>
+              <w:jc w:val="center"/>
+            </w:pPr>
+            <w:r>
+              <w:rPr>
+                <w:rFonts w:ascii="Times New Roman" w:hAnsi="Times New Roman"/>
+                <w:color w:val="000000"/>
+                <w:sz w:val="22"/>
+              </w:rPr>
+              <w:t>15%</w:t>
+            </w:r>
+          </w:p>
+        </w:tc>
+        <w:tc>
+          <w:tcPr>
+            <w:tcW w:type="dxa" w:w="2280"/>
+            <w:shd w:val="clear" w:color="auto" w:fill="FFFFFF"/>
+            <w:tcBorders>
+              <w:top w:val="single" w:sz="4" w:space="0" w:color="000000"/>
+              <w:left w:val="single" w:sz="4" w:space="0" w:color="000000"/>
+              <w:bottom w:val="single" w:sz="4" w:space="0" w:color="000000"/>
+              <w:right w:val="single" w:sz="4" w:space="0" w:color="000000"/>
+            </w:tcBorders>
+          </w:tcPr>
+          <w:p>
+            <w:pPr>
+              <w:jc w:val="center"/>
+            </w:pPr>
+            <w:r>
+              <w:rPr>
+                <w:rFonts w:ascii="Times New Roman" w:hAnsi="Times New Roman"/>
+                <w:color w:val="000000"/>
+                <w:sz w:val="22"/>
+              </w:rPr>
+              <w:t>Littérature clinique</w:t>
+            </w:r>
+          </w:p>
+        </w:tc>
+      </w:tr>
+    </w:tbl>
+    <w:p>
+      <w:pPr>
+        <w:jc w:val="both"/>
+        <w:spacing w:after="120"/>
+      </w:pPr>
+      <w:r>
+        <w:rPr>
+          <w:rFonts w:ascii="Times New Roman" w:hAnsi="Times New Roman"/>
+          <w:sz w:val="24"/>
+        </w:rPr>
       </w:r>
     </w:p>
     <w:p>
       <w:pPr>
-        <w:spacing w:after="60"/>
-        <w:ind w:left="283" w:hanging="227"/>
-        <w:rPr>
-          <w:lang w:val="fr-FR"/>
-        </w:rPr>
-      </w:pPr>
-      <w:r>
-        <w:rPr>
-          <w:rFonts w:ascii="Times New Roman" w:hAnsi="Times New Roman"/>
-          <w:lang w:val="fr-FR"/>
-        </w:rPr>
-        <w:t xml:space="preserve">• </w:t>
-      </w:r>
-      <w:proofErr w:type="spellStart"/>
-      <w:r>
-        <w:rPr>
-          <w:rFonts w:ascii="Times New Roman" w:hAnsi="Times New Roman"/>
-          <w:lang w:val="fr-FR"/>
-        </w:rPr>
-        <w:t>Seed</w:t>
-      </w:r>
-      <w:proofErr w:type="spellEnd"/>
-      <w:r>
-        <w:rPr>
-          <w:rFonts w:ascii="Times New Roman" w:hAnsi="Times New Roman"/>
-          <w:lang w:val="fr-FR"/>
-        </w:rPr>
-        <w:t xml:space="preserve"> aléatoire fixé pour reproductibilité (</w:t>
-      </w:r>
-      <w:proofErr w:type="spellStart"/>
-      <w:proofErr w:type="gramStart"/>
-      <w:r>
-        <w:rPr>
-          <w:rFonts w:ascii="Times New Roman" w:hAnsi="Times New Roman"/>
-          <w:lang w:val="fr-FR"/>
-        </w:rPr>
-        <w:t>set.seed</w:t>
-      </w:r>
-      <w:proofErr w:type="spellEnd"/>
-      <w:proofErr w:type="gramEnd"/>
-      <w:r>
-        <w:rPr>
-          <w:rFonts w:ascii="Times New Roman" w:hAnsi="Times New Roman"/>
-          <w:lang w:val="fr-FR"/>
-        </w:rPr>
-        <w:t>(42))</w:t>
+        <w:jc w:val="left"/>
+        <w:spacing w:before="180" w:after="90"/>
+      </w:pPr>
+      <w:r>
+        <w:rPr>
+          <w:rFonts w:ascii="Times New Roman" w:hAnsi="Times New Roman"/>
+          <w:b/>
+          <w:color w:val="2C3E50"/>
+          <w:sz w:val="24"/>
+        </w:rPr>
+        <w:t>Procédure de simulation Monte-Carlo</w:t>
       </w:r>
     </w:p>
     <w:p>
       <w:pPr>
+        <w:jc w:val="both"/>
         <w:spacing w:after="120"/>
-        <w:ind w:firstLine="567"/>
+      </w:pPr>
+      <w:r>
+        <w:rPr>
+          <w:rFonts w:ascii="Times New Roman" w:hAnsi="Times New Roman"/>
+          <w:sz w:val="24"/>
+        </w:rPr>
+        <w:t>Pour chaque patient simulé i (i = 1, …, 300), la procédure suit les étapes suivantes :</w:t>
+      </w:r>
+    </w:p>
+    <w:p>
+      <w:pPr>
         <w:jc w:val="both"/>
-        <w:rPr>
-          <w:lang w:val="fr-FR"/>
-        </w:rPr>
-      </w:pPr>
-      <w:r>
-        <w:rPr>
-          <w:rFonts w:ascii="Times New Roman" w:hAnsi="Times New Roman"/>
-          <w:sz w:val="24"/>
-          <w:lang w:val="fr-FR"/>
-        </w:rPr>
-        <w:t>Pour chaque patient simulé, le système ODE complet (PK + Damage + PD) est résolu numériquement via rxode2 (solveur LSODA) sur 126 jours. Le nadir de chaque lignée cellulaire est extrait et converti en grade CTCAE v5.</w:t>
+        <w:ind w:left="284" w:hanging="284"/>
+        <w:spacing w:after="60"/>
+      </w:pPr>
+      <w:r>
+        <w:rPr>
+          <w:rFonts w:ascii="Times New Roman" w:hAnsi="Times New Roman"/>
+          <w:sz w:val="24"/>
+        </w:rPr>
+        <w:t>• Tirage aléatoire des paramètres individuels : θᵢ = θ_pop × exp(ηᵢ), avec ηᵢ ~ N(0, ω²) pour chaque paramètre PK et PD</w:t>
+      </w:r>
+    </w:p>
+    <w:p>
+      <w:pPr>
+        <w:jc w:val="both"/>
+        <w:ind w:left="284" w:hanging="284"/>
+        <w:spacing w:after="60"/>
+      </w:pPr>
+      <w:r>
+        <w:rPr>
+          <w:rFonts w:ascii="Times New Roman" w:hAnsi="Times New Roman"/>
+          <w:sz w:val="24"/>
+        </w:rPr>
+        <w:t>• Calcul de la dose individuelle : Dose_mg = 5,4 mg/kg × BWᵢ, arrondie à la dizaine de mg (pratique clinique standard)</w:t>
+      </w:r>
+    </w:p>
+    <w:p>
+      <w:pPr>
+        <w:jc w:val="both"/>
+        <w:ind w:left="284" w:hanging="284"/>
+        <w:spacing w:after="60"/>
+      </w:pPr>
+      <w:r>
+        <w:rPr>
+          <w:rFonts w:ascii="Times New Roman" w:hAnsi="Times New Roman"/>
+          <w:sz w:val="24"/>
+        </w:rPr>
+        <w:t>• Résolution numérique du système ODE complet (PK + Damage + PD) via rxode2 (solveur LSODA, pas adaptatif) sur 126 jours, avec administration IV aux jours 1, 22, 43, 64, 85, 106</w:t>
+      </w:r>
+    </w:p>
+    <w:p>
+      <w:pPr>
+        <w:jc w:val="both"/>
+        <w:ind w:left="284" w:hanging="284"/>
+        <w:spacing w:after="60"/>
+      </w:pPr>
+      <w:r>
+        <w:rPr>
+          <w:rFonts w:ascii="Times New Roman" w:hAnsi="Times New Roman"/>
+          <w:sz w:val="24"/>
+        </w:rPr>
+        <w:t>• Extraction du nadir pour chaque lignée : min(Neut(t)), min(Plt(t)), min(RBC(t)) sur t ∈ [0, 126 jours]</w:t>
+      </w:r>
+    </w:p>
+    <w:p>
+      <w:pPr>
+        <w:jc w:val="both"/>
+        <w:ind w:left="284" w:hanging="284"/>
+        <w:spacing w:after="60"/>
+      </w:pPr>
+      <w:r>
+        <w:rPr>
+          <w:rFonts w:ascii="Times New Roman" w:hAnsi="Times New Roman"/>
+          <w:sz w:val="24"/>
+        </w:rPr>
+        <w:t>• Attribution du grade CTCAE v5 par comparaison du nadir aux seuils (cf. §2.5)</w:t>
+      </w:r>
+    </w:p>
+    <w:p>
+      <w:pPr>
+        <w:jc w:val="both"/>
+        <w:spacing w:after="120"/>
+      </w:pPr>
+      <w:r>
+        <w:rPr>
+          <w:rFonts w:ascii="Times New Roman" w:hAnsi="Times New Roman"/>
+          <w:sz w:val="24"/>
+        </w:rPr>
+        <w:t>Le générateur pseudo-aléatoire est initialisé avec une graine fixe (set.seed(42)) garantissant la reproductibilité exacte des résultats. La taille de N=300 patients a été choisie pour assurer une estimation stable des proportions de grades rares (G4 &lt; 5%) avec une erreur standard inférieure à 1,5 point de pourcentage (intervalle de confiance à 95% : ±1,5%).</w:t>
+      </w:r>
+    </w:p>
+    <w:p>
+      <w:pPr>
+        <w:jc w:val="left"/>
+        <w:spacing w:before="180" w:after="90"/>
+      </w:pPr>
+      <w:r>
+        <w:rPr>
+          <w:rFonts w:ascii="Times New Roman" w:hAnsi="Times New Roman"/>
+          <w:b/>
+          <w:color w:val="2C3E50"/>
+          <w:sz w:val="24"/>
+        </w:rPr>
+        <w:t>Résumé statistique des grades simulés</w:t>
+      </w:r>
+    </w:p>
+    <w:p>
+      <w:pPr>
+        <w:jc w:val="both"/>
+        <w:spacing w:after="120"/>
+      </w:pPr>
+      <w:r>
+        <w:rPr>
+          <w:rFonts w:ascii="Times New Roman" w:hAnsi="Times New Roman"/>
+          <w:sz w:val="24"/>
+        </w:rPr>
+        <w:t>Pour chaque toxicité, les résultats sont résumés par la proportion de patients atteignant chaque grade (G0 à G4), le taux de tout grade (G≥1 = 100% − %G0) et le taux de grade sévère (G3-4 = %G3 + %G4). Ces métriques sont directement comparables aux données de fréquence rapportées dans les notices médicamenteuses et les publications d'essais cliniques.</w:t>
       </w:r>
     </w:p>
     <w:p>

</xml_diff>